<commit_message>
Deployed 7bb81ec with MkDocs version: 1.6.1
</commit_message>
<xml_diff>
--- a/tema3/plantillas/Actividad_3_1_INU_Plantilla.docx
+++ b/tema3/plantillas/Actividad_3_1_INU_Plantilla.docx
@@ -222,7 +222,7 @@
           <w:sz w:val="24"/>
           <w:szCs w:val="24"/>
         </w:rPr>
-        <w:t xml:space="preserve">Paso 1 — Prepara el escenario: bucket nuevo e instancias del festival</w:t>
+        <w:t xml:space="preserve">Paso 1 — Despliega la red y prepara el escenario</w:t>
       </w:r>
     </w:p>
     <w:tbl>
@@ -525,7 +525,7 @@
           <w:sz w:val="24"/>
           <w:szCs w:val="24"/>
         </w:rPr>
-        <w:t xml:space="preserve">Paso 2 — Amplía el disco de una instancia por CLI</w:t>
+        <w:t xml:space="preserve">Paso 2 — Amplía el disco de una instancia, sin cortar el servicio</w:t>
       </w:r>
     </w:p>
     <w:tbl>
@@ -618,27 +618,8 @@
     </w:tbl>
     <w:p>
       <w:pPr>
-        <w:spacing w:after="200"/>
-      </w:pPr>
-    </w:p>
-    <w:p>
-      <w:pPr>
-        <w:pBdr>
-          <w:bottom w:val="single" w:color="FFA000" w:sz="4" w:space="1"/>
-        </w:pBdr>
-        <w:spacing w:after="120" w:before="240"/>
-      </w:pPr>
-      <w:r>
-        <w:rPr>
-          <w:rFonts w:ascii="Arial" w:cs="Arial" w:eastAsia="Arial" w:hAnsi="Arial"/>
-          <w:b/>
-          <w:bCs/>
-          <w:color w:val="3949AB"/>
-          <w:sz w:val="24"/>
-          <w:szCs w:val="24"/>
-        </w:rPr>
-        <w:t xml:space="preserve">Paso 3 — Comparte las fotos entre las dos instancias con EFS</w:t>
-      </w:r>
+        <w:spacing w:after="120"/>
+      </w:pPr>
     </w:p>
     <w:tbl>
       <w:tblPr>
@@ -683,7 +664,7 @@
                 <w:sz w:val="20"/>
                 <w:szCs w:val="20"/>
               </w:rPr>
-              <w:t xml:space="preserve">📸 Sistema de archivos EFS creado, con sus dos puntos de montaje</w:t>
+              <w:t xml:space="preserve">📸 Comando dentro de la instancia mostrando el nuevo tamaño disponible</w:t>
             </w:r>
           </w:p>
         </w:tc>
@@ -730,8 +711,27 @@
     </w:tbl>
     <w:p>
       <w:pPr>
-        <w:spacing w:after="120"/>
-      </w:pPr>
+        <w:spacing w:after="200"/>
+      </w:pPr>
+    </w:p>
+    <w:p>
+      <w:pPr>
+        <w:pBdr>
+          <w:bottom w:val="single" w:color="FFA000" w:sz="4" w:space="1"/>
+        </w:pBdr>
+        <w:spacing w:after="120" w:before="240"/>
+      </w:pPr>
+      <w:r>
+        <w:rPr>
+          <w:rFonts w:ascii="Arial" w:cs="Arial" w:eastAsia="Arial" w:hAnsi="Arial"/>
+          <w:b/>
+          <w:bCs/>
+          <w:color w:val="3949AB"/>
+          <w:sz w:val="24"/>
+          <w:szCs w:val="24"/>
+        </w:rPr>
+        <w:t xml:space="preserve">Paso 3 — Comparte las fotos entre las dos instancias con EFS</w:t>
+      </w:r>
     </w:p>
     <w:tbl>
       <w:tblPr>
@@ -776,7 +776,7 @@
                 <w:sz w:val="20"/>
                 <w:szCs w:val="20"/>
               </w:rPr>
-              <w:t xml:space="preserve">📸 La misma foto visible desde las dos instancias tras montar el EFS</w:t>
+              <w:t xml:space="preserve">📸 Sistema de archivos EFS creado, con sus dos puntos de montaje</w:t>
             </w:r>
           </w:p>
         </w:tc>
@@ -823,46 +823,8 @@
     </w:tbl>
     <w:p>
       <w:pPr>
-        <w:spacing w:after="200"/>
-      </w:pPr>
-    </w:p>
-    <w:p>
-      <w:r>
-        <w:br w:type="page"/>
-      </w:r>
-    </w:p>
-    <w:p>
-      <w:pPr>
-        <w:pBdr>
-          <w:bottom w:val="single" w:color="FFA000" w:sz="4" w:space="1"/>
-        </w:pBdr>
-        <w:spacing w:after="120" w:before="240"/>
-      </w:pPr>
-      <w:r>
-        <w:rPr>
-          <w:rFonts w:ascii="Arial" w:cs="Arial" w:eastAsia="Arial" w:hAnsi="Arial"/>
-          <w:b/>
-          <w:bCs/>
-          <w:color w:val="3949AB"/>
-          <w:sz w:val="24"/>
-          <w:szCs w:val="24"/>
-        </w:rPr>
-        <w:t xml:space="preserve">Reflexiona</w:t>
-      </w:r>
-    </w:p>
-    <w:p>
-      <w:pPr>
-        <w:spacing w:after="100"/>
-      </w:pPr>
-      <w:r>
-        <w:rPr>
-          <w:rFonts w:ascii="Arial" w:cs="Arial" w:eastAsia="Arial" w:hAnsi="Arial"/>
-          <w:color w:val="212121"/>
-          <w:sz w:val="22"/>
-          <w:szCs w:val="22"/>
-        </w:rPr>
-        <w:t xml:space="preserve">Has resuelto la misma pregunta —¿dónde guardo esto?— de tres formas distintas en la misma sesión. Si mañana necesitaras guardar las grabaciones completas de los conciertos del festival, un archivo pesado que casi nadie va a volver a consultar salvo que haya una reclamación puntual, ¿cuál de las tres familias elegirías y por qué esa y no las otras dos?</w:t>
-      </w:r>
+        <w:spacing w:after="120"/>
+      </w:pPr>
     </w:p>
     <w:tbl>
       <w:tblPr>
@@ -880,8 +842,41 @@
         <w:gridCol w:w="9638"/>
       </w:tblGrid>
       <w:tr>
+        <w:tc>
+          <w:tcPr>
+            <w:tcW w:type="dxa" w:w="9638"/>
+            <w:tcBorders>
+              <w:top w:val="none" w:color="FFFFFF" w:sz="0"/>
+              <w:left w:val="none" w:color="FFFFFF" w:sz="0"/>
+              <w:bottom w:val="none" w:color="FFFFFF" w:sz="0"/>
+              <w:right w:val="none" w:color="FFFFFF" w:sz="0"/>
+            </w:tcBorders>
+            <w:shd w:fill="3949AB" w:val="clear"/>
+            <w:tcMar>
+              <w:top w:type="dxa" w:w="80"/>
+              <w:left w:type="dxa" w:w="160"/>
+              <w:bottom w:type="dxa" w:w="80"/>
+              <w:right w:type="dxa" w:w="160"/>
+            </w:tcMar>
+          </w:tcPr>
+          <w:p>
+            <w:r>
+              <w:rPr>
+                <w:rFonts w:ascii="Arial" w:cs="Arial" w:eastAsia="Arial" w:hAnsi="Arial"/>
+                <w:b/>
+                <w:bCs/>
+                <w:color w:val="FFFFFF"/>
+                <w:sz w:val="20"/>
+                <w:szCs w:val="20"/>
+              </w:rPr>
+              <w:t xml:space="preserve">📸 La misma foto visible desde las dos instancias tras montar el EFS</w:t>
+            </w:r>
+          </w:p>
+        </w:tc>
+      </w:tr>
+      <w:tr>
         <w:trPr>
-          <w:trHeight w:val="480"/>
+          <w:trHeight w:val="2400"/>
         </w:trPr>
         <w:tc>
           <w:tcPr>
@@ -894,115 +889,26 @@
             </w:tcBorders>
             <w:shd w:fill="FAFAFA" w:val="clear"/>
             <w:tcMar>
-              <w:top w:type="dxa" w:w="60"/>
-              <w:left w:type="dxa" w:w="160"/>
-              <w:bottom w:type="dxa" w:w="60"/>
-              <w:right w:type="dxa" w:w="160"/>
-            </w:tcMar>
-          </w:tcPr>
-          <w:p>
-            <w:r>
-              <w:rPr>
-                <w:sz w:val="22"/>
-                <w:szCs w:val="22"/>
-              </w:rPr>
-              <w:t xml:space="preserve"/>
-            </w:r>
-          </w:p>
-        </w:tc>
-      </w:tr>
-      <w:tr>
-        <w:trPr>
-          <w:trHeight w:val="480"/>
-        </w:trPr>
-        <w:tc>
-          <w:tcPr>
-            <w:tcW w:type="dxa" w:w="9638"/>
-            <w:tcBorders>
-              <w:top w:val="single" w:color="E0E0E0" w:sz="4"/>
-              <w:left w:val="single" w:color="E0E0E0" w:sz="4"/>
-              <w:bottom w:val="single" w:color="E0E0E0" w:sz="4"/>
-              <w:right w:val="single" w:color="E0E0E0" w:sz="4"/>
-            </w:tcBorders>
-            <w:shd w:fill="FAFAFA" w:val="clear"/>
-            <w:tcMar>
-              <w:top w:type="dxa" w:w="60"/>
-              <w:left w:type="dxa" w:w="160"/>
-              <w:bottom w:type="dxa" w:w="60"/>
-              <w:right w:type="dxa" w:w="160"/>
-            </w:tcMar>
-          </w:tcPr>
-          <w:p>
-            <w:r>
-              <w:rPr>
-                <w:sz w:val="22"/>
-                <w:szCs w:val="22"/>
-              </w:rPr>
-              <w:t xml:space="preserve"/>
-            </w:r>
-          </w:p>
-        </w:tc>
-      </w:tr>
-      <w:tr>
-        <w:trPr>
-          <w:trHeight w:val="480"/>
-        </w:trPr>
-        <w:tc>
-          <w:tcPr>
-            <w:tcW w:type="dxa" w:w="9638"/>
-            <w:tcBorders>
-              <w:top w:val="single" w:color="E0E0E0" w:sz="4"/>
-              <w:left w:val="single" w:color="E0E0E0" w:sz="4"/>
-              <w:bottom w:val="single" w:color="E0E0E0" w:sz="4"/>
-              <w:right w:val="single" w:color="E0E0E0" w:sz="4"/>
-            </w:tcBorders>
-            <w:shd w:fill="FAFAFA" w:val="clear"/>
-            <w:tcMar>
-              <w:top w:type="dxa" w:w="60"/>
-              <w:left w:type="dxa" w:w="160"/>
-              <w:bottom w:type="dxa" w:w="60"/>
-              <w:right w:type="dxa" w:w="160"/>
-            </w:tcMar>
-          </w:tcPr>
-          <w:p>
-            <w:r>
-              <w:rPr>
-                <w:sz w:val="22"/>
-                <w:szCs w:val="22"/>
-              </w:rPr>
-              <w:t xml:space="preserve"/>
-            </w:r>
-          </w:p>
-        </w:tc>
-      </w:tr>
-      <w:tr>
-        <w:trPr>
-          <w:trHeight w:val="480"/>
-        </w:trPr>
-        <w:tc>
-          <w:tcPr>
-            <w:tcW w:type="dxa" w:w="9638"/>
-            <w:tcBorders>
-              <w:top w:val="single" w:color="E0E0E0" w:sz="4"/>
-              <w:left w:val="single" w:color="E0E0E0" w:sz="4"/>
-              <w:bottom w:val="single" w:color="E0E0E0" w:sz="4"/>
-              <w:right w:val="single" w:color="E0E0E0" w:sz="4"/>
-            </w:tcBorders>
-            <w:shd w:fill="FAFAFA" w:val="clear"/>
-            <w:tcMar>
-              <w:top w:type="dxa" w:w="60"/>
-              <w:left w:type="dxa" w:w="160"/>
-              <w:bottom w:type="dxa" w:w="60"/>
-              <w:right w:type="dxa" w:w="160"/>
-            </w:tcMar>
-          </w:tcPr>
-          <w:p>
-            <w:r>
-              <w:rPr>
-                <w:sz w:val="22"/>
-                <w:szCs w:val="22"/>
-              </w:rPr>
-              <w:t xml:space="preserve"/>
+              <w:top w:type="dxa" w:w="80"/>
+              <w:left w:type="dxa" w:w="160"/>
+              <w:bottom w:type="dxa" w:w="80"/>
+              <w:right w:type="dxa" w:w="160"/>
+            </w:tcMar>
+          </w:tcPr>
+          <w:p>
+            <w:pPr>
+              <w:jc w:val="center"/>
+            </w:pPr>
+            <w:r>
+              <w:rPr>
+                <w:rFonts w:ascii="Arial" w:cs="Arial" w:eastAsia="Arial" w:hAnsi="Arial"/>
+                <w:i/>
+                <w:iCs/>
+                <w:color w:val="757575"/>
+                <w:sz w:val="20"/>
+                <w:szCs w:val="20"/>
+              </w:rPr>
+              <w:t xml:space="preserve">[Pega aquí la captura de pantalla]</w:t>
             </w:r>
           </w:p>
         </w:tc>
@@ -1017,29 +923,6 @@
       <w:r>
         <w:br w:type="page"/>
       </w:r>
-    </w:p>
-    <w:p>
-      <w:pPr>
-        <w:shd w:fill="3949AB" w:val="clear"/>
-        <w:spacing w:after="0" w:before="320"/>
-        <w:ind w:left="200" w:right="200"/>
-      </w:pPr>
-      <w:r>
-        <w:rPr>
-          <w:rFonts w:ascii="Arial" w:cs="Arial" w:eastAsia="Arial" w:hAnsi="Arial"/>
-          <w:b/>
-          <w:bCs/>
-          <w:color w:val="FFFFFF"/>
-          <w:sz w:val="26"/>
-          <w:szCs w:val="26"/>
-        </w:rPr>
-        <w:t xml:space="preserve">Parte B — Reto: recuperar, ampliar en caliente y decidir por coste</w:t>
-      </w:r>
-    </w:p>
-    <w:p>
-      <w:pPr>
-        <w:spacing w:after="120"/>
-      </w:pPr>
     </w:p>
     <w:p>
       <w:pPr>
@@ -1057,7 +940,7 @@
           <w:sz w:val="24"/>
           <w:szCs w:val="24"/>
         </w:rPr>
-        <w:t xml:space="preserve">Recupera lo irrecuperable</w:t>
+        <w:t xml:space="preserve">Reflexiona</w:t>
       </w:r>
     </w:p>
     <w:p>
@@ -1071,7 +954,7 @@
           <w:sz w:val="22"/>
           <w:szCs w:val="22"/>
         </w:rPr>
-        <w:t xml:space="preserve">Borra 'por accidente' una foto del bucket versionado del Paso 1, y recupérala sin perder ni una versión. Documenta cómo lo has hecho.</w:t>
+        <w:t xml:space="preserve">Has resuelto la misma pregunta —¿dónde guardo esto?— de tres formas distintas en la misma sesión. Si mañana necesitaras guardar las grabaciones completas de los conciertos del festival, un archivo pesado que casi nadie va a volver a consultar salvo que haya una reclamación puntual, ¿cuál de las tres familias elegirías y por qué esa y no las otras dos?</w:t>
       </w:r>
     </w:p>
     <w:tbl>
@@ -1090,41 +973,8 @@
         <w:gridCol w:w="9638"/>
       </w:tblGrid>
       <w:tr>
-        <w:tc>
-          <w:tcPr>
-            <w:tcW w:type="dxa" w:w="9638"/>
-            <w:tcBorders>
-              <w:top w:val="none" w:color="FFFFFF" w:sz="0"/>
-              <w:left w:val="none" w:color="FFFFFF" w:sz="0"/>
-              <w:bottom w:val="none" w:color="FFFFFF" w:sz="0"/>
-              <w:right w:val="none" w:color="FFFFFF" w:sz="0"/>
-            </w:tcBorders>
-            <w:shd w:fill="3949AB" w:val="clear"/>
-            <w:tcMar>
-              <w:top w:type="dxa" w:w="80"/>
-              <w:left w:type="dxa" w:w="160"/>
-              <w:bottom w:type="dxa" w:w="80"/>
-              <w:right w:type="dxa" w:w="160"/>
-            </w:tcMar>
-          </w:tcPr>
-          <w:p>
-            <w:r>
-              <w:rPr>
-                <w:rFonts w:ascii="Arial" w:cs="Arial" w:eastAsia="Arial" w:hAnsi="Arial"/>
-                <w:b/>
-                <w:bCs/>
-                <w:color w:val="FFFFFF"/>
-                <w:sz w:val="20"/>
-                <w:szCs w:val="20"/>
-              </w:rPr>
-              <w:t xml:space="preserve">📸 Foto recuperada y su historial de versiones</w:t>
-            </w:r>
-          </w:p>
-        </w:tc>
-      </w:tr>
-      <w:tr>
         <w:trPr>
-          <w:trHeight w:val="2400"/>
+          <w:trHeight w:val="480"/>
         </w:trPr>
         <w:tc>
           <w:tcPr>
@@ -1137,26 +987,115 @@
             </w:tcBorders>
             <w:shd w:fill="FAFAFA" w:val="clear"/>
             <w:tcMar>
-              <w:top w:type="dxa" w:w="80"/>
-              <w:left w:type="dxa" w:w="160"/>
-              <w:bottom w:type="dxa" w:w="80"/>
-              <w:right w:type="dxa" w:w="160"/>
-            </w:tcMar>
-          </w:tcPr>
-          <w:p>
-            <w:pPr>
-              <w:jc w:val="center"/>
-            </w:pPr>
-            <w:r>
-              <w:rPr>
-                <w:rFonts w:ascii="Arial" w:cs="Arial" w:eastAsia="Arial" w:hAnsi="Arial"/>
-                <w:i/>
-                <w:iCs/>
-                <w:color w:val="757575"/>
-                <w:sz w:val="20"/>
-                <w:szCs w:val="20"/>
-              </w:rPr>
-              <w:t xml:space="preserve">[Pega aquí la captura de pantalla]</w:t>
+              <w:top w:type="dxa" w:w="60"/>
+              <w:left w:type="dxa" w:w="160"/>
+              <w:bottom w:type="dxa" w:w="60"/>
+              <w:right w:type="dxa" w:w="160"/>
+            </w:tcMar>
+          </w:tcPr>
+          <w:p>
+            <w:r>
+              <w:rPr>
+                <w:sz w:val="22"/>
+                <w:szCs w:val="22"/>
+              </w:rPr>
+              <w:t xml:space="preserve"/>
+            </w:r>
+          </w:p>
+        </w:tc>
+      </w:tr>
+      <w:tr>
+        <w:trPr>
+          <w:trHeight w:val="480"/>
+        </w:trPr>
+        <w:tc>
+          <w:tcPr>
+            <w:tcW w:type="dxa" w:w="9638"/>
+            <w:tcBorders>
+              <w:top w:val="single" w:color="E0E0E0" w:sz="4"/>
+              <w:left w:val="single" w:color="E0E0E0" w:sz="4"/>
+              <w:bottom w:val="single" w:color="E0E0E0" w:sz="4"/>
+              <w:right w:val="single" w:color="E0E0E0" w:sz="4"/>
+            </w:tcBorders>
+            <w:shd w:fill="FAFAFA" w:val="clear"/>
+            <w:tcMar>
+              <w:top w:type="dxa" w:w="60"/>
+              <w:left w:type="dxa" w:w="160"/>
+              <w:bottom w:type="dxa" w:w="60"/>
+              <w:right w:type="dxa" w:w="160"/>
+            </w:tcMar>
+          </w:tcPr>
+          <w:p>
+            <w:r>
+              <w:rPr>
+                <w:sz w:val="22"/>
+                <w:szCs w:val="22"/>
+              </w:rPr>
+              <w:t xml:space="preserve"/>
+            </w:r>
+          </w:p>
+        </w:tc>
+      </w:tr>
+      <w:tr>
+        <w:trPr>
+          <w:trHeight w:val="480"/>
+        </w:trPr>
+        <w:tc>
+          <w:tcPr>
+            <w:tcW w:type="dxa" w:w="9638"/>
+            <w:tcBorders>
+              <w:top w:val="single" w:color="E0E0E0" w:sz="4"/>
+              <w:left w:val="single" w:color="E0E0E0" w:sz="4"/>
+              <w:bottom w:val="single" w:color="E0E0E0" w:sz="4"/>
+              <w:right w:val="single" w:color="E0E0E0" w:sz="4"/>
+            </w:tcBorders>
+            <w:shd w:fill="FAFAFA" w:val="clear"/>
+            <w:tcMar>
+              <w:top w:type="dxa" w:w="60"/>
+              <w:left w:type="dxa" w:w="160"/>
+              <w:bottom w:type="dxa" w:w="60"/>
+              <w:right w:type="dxa" w:w="160"/>
+            </w:tcMar>
+          </w:tcPr>
+          <w:p>
+            <w:r>
+              <w:rPr>
+                <w:sz w:val="22"/>
+                <w:szCs w:val="22"/>
+              </w:rPr>
+              <w:t xml:space="preserve"/>
+            </w:r>
+          </w:p>
+        </w:tc>
+      </w:tr>
+      <w:tr>
+        <w:trPr>
+          <w:trHeight w:val="480"/>
+        </w:trPr>
+        <w:tc>
+          <w:tcPr>
+            <w:tcW w:type="dxa" w:w="9638"/>
+            <w:tcBorders>
+              <w:top w:val="single" w:color="E0E0E0" w:sz="4"/>
+              <w:left w:val="single" w:color="E0E0E0" w:sz="4"/>
+              <w:bottom w:val="single" w:color="E0E0E0" w:sz="4"/>
+              <w:right w:val="single" w:color="E0E0E0" w:sz="4"/>
+            </w:tcBorders>
+            <w:shd w:fill="FAFAFA" w:val="clear"/>
+            <w:tcMar>
+              <w:top w:type="dxa" w:w="60"/>
+              <w:left w:type="dxa" w:w="160"/>
+              <w:bottom w:type="dxa" w:w="60"/>
+              <w:right w:type="dxa" w:w="160"/>
+            </w:tcMar>
+          </w:tcPr>
+          <w:p>
+            <w:r>
+              <w:rPr>
+                <w:sz w:val="22"/>
+                <w:szCs w:val="22"/>
+              </w:rPr>
+              <w:t xml:space="preserve"/>
             </w:r>
           </w:p>
         </w:tc>
@@ -1164,7 +1103,35 @@
     </w:tbl>
     <w:p>
       <w:pPr>
-        <w:spacing w:after="160"/>
+        <w:spacing w:after="200"/>
+      </w:pPr>
+    </w:p>
+    <w:p>
+      <w:r>
+        <w:br w:type="page"/>
+      </w:r>
+    </w:p>
+    <w:p>
+      <w:pPr>
+        <w:shd w:fill="3949AB" w:val="clear"/>
+        <w:spacing w:after="0" w:before="320"/>
+        <w:ind w:left="200" w:right="200"/>
+      </w:pPr>
+      <w:r>
+        <w:rPr>
+          <w:rFonts w:ascii="Arial" w:cs="Arial" w:eastAsia="Arial" w:hAnsi="Arial"/>
+          <w:b/>
+          <w:bCs/>
+          <w:color w:val="FFFFFF"/>
+          <w:sz w:val="26"/>
+          <w:szCs w:val="26"/>
+        </w:rPr>
+        <w:t xml:space="preserve">Parte B — Reto: recuperar, acceder por HTTP y decidir por coste</w:t>
+      </w:r>
+    </w:p>
+    <w:p>
+      <w:pPr>
+        <w:spacing w:after="120"/>
       </w:pPr>
     </w:p>
     <w:p>
@@ -1183,7 +1150,7 @@
           <w:sz w:val="24"/>
           <w:szCs w:val="24"/>
         </w:rPr>
-        <w:t xml:space="preserve">Amplía en caliente de verdad</w:t>
+        <w:t xml:space="preserve">Recupera lo irrecuperable</w:t>
       </w:r>
     </w:p>
     <w:p>
@@ -1197,7 +1164,7 @@
           <w:sz w:val="22"/>
           <w:szCs w:val="22"/>
         </w:rPr>
-        <w:t xml:space="preserve">Sin reiniciar la instancia ni cortar el servicio, consigue que el sistema de ficheros del sistema operativo reconozca el nuevo tamaño del volumen. Demuestra con un comando dentro de la instancia que el nuevo espacio ya está disponible para escribir.</w:t>
+        <w:t xml:space="preserve">Borra 'por accidente' una foto del bucket versionado del Paso 1, y recupérala sin perder ni una versión. Documenta cómo lo has hecho.</w:t>
       </w:r>
     </w:p>
     <w:tbl>
@@ -1243,7 +1210,226 @@
                 <w:sz w:val="20"/>
                 <w:szCs w:val="20"/>
               </w:rPr>
-              <w:t xml:space="preserve">📸 Comando dentro de la instancia mostrando el nuevo tamaño disponible</w:t>
+              <w:t xml:space="preserve">📸 Historial de versiones con el marcador de eliminación todavía presente</w:t>
+            </w:r>
+          </w:p>
+        </w:tc>
+      </w:tr>
+      <w:tr>
+        <w:trPr>
+          <w:trHeight w:val="2400"/>
+        </w:trPr>
+        <w:tc>
+          <w:tcPr>
+            <w:tcW w:type="dxa" w:w="9638"/>
+            <w:tcBorders>
+              <w:top w:val="single" w:color="E0E0E0" w:sz="4"/>
+              <w:left w:val="single" w:color="E0E0E0" w:sz="4"/>
+              <w:bottom w:val="single" w:color="E0E0E0" w:sz="4"/>
+              <w:right w:val="single" w:color="E0E0E0" w:sz="4"/>
+            </w:tcBorders>
+            <w:shd w:fill="FAFAFA" w:val="clear"/>
+            <w:tcMar>
+              <w:top w:type="dxa" w:w="80"/>
+              <w:left w:type="dxa" w:w="160"/>
+              <w:bottom w:type="dxa" w:w="80"/>
+              <w:right w:type="dxa" w:w="160"/>
+            </w:tcMar>
+          </w:tcPr>
+          <w:p>
+            <w:pPr>
+              <w:jc w:val="center"/>
+            </w:pPr>
+            <w:r>
+              <w:rPr>
+                <w:rFonts w:ascii="Arial" w:cs="Arial" w:eastAsia="Arial" w:hAnsi="Arial"/>
+                <w:i/>
+                <w:iCs/>
+                <w:color w:val="757575"/>
+                <w:sz w:val="20"/>
+                <w:szCs w:val="20"/>
+              </w:rPr>
+              <w:t xml:space="preserve">[Pega aquí la captura de pantalla]</w:t>
+            </w:r>
+          </w:p>
+        </w:tc>
+      </w:tr>
+    </w:tbl>
+    <w:p>
+      <w:pPr>
+        <w:spacing w:after="120"/>
+      </w:pPr>
+    </w:p>
+    <w:tbl>
+      <w:tblPr>
+        <w:tblW w:type="dxa" w:w="9638"/>
+        <w:tblBorders>
+          <w:top w:val="single" w:color="auto" w:sz="4"/>
+          <w:left w:val="single" w:color="auto" w:sz="4"/>
+          <w:bottom w:val="single" w:color="auto" w:sz="4"/>
+          <w:right w:val="single" w:color="auto" w:sz="4"/>
+          <w:insideH w:val="single" w:color="auto" w:sz="4"/>
+          <w:insideV w:val="single" w:color="auto" w:sz="4"/>
+        </w:tblBorders>
+      </w:tblPr>
+      <w:tblGrid>
+        <w:gridCol w:w="9638"/>
+      </w:tblGrid>
+      <w:tr>
+        <w:tc>
+          <w:tcPr>
+            <w:tcW w:type="dxa" w:w="9638"/>
+            <w:tcBorders>
+              <w:top w:val="none" w:color="FFFFFF" w:sz="0"/>
+              <w:left w:val="none" w:color="FFFFFF" w:sz="0"/>
+              <w:bottom w:val="none" w:color="FFFFFF" w:sz="0"/>
+              <w:right w:val="none" w:color="FFFFFF" w:sz="0"/>
+            </w:tcBorders>
+            <w:shd w:fill="3949AB" w:val="clear"/>
+            <w:tcMar>
+              <w:top w:type="dxa" w:w="80"/>
+              <w:left w:type="dxa" w:w="160"/>
+              <w:bottom w:type="dxa" w:w="80"/>
+              <w:right w:type="dxa" w:w="160"/>
+            </w:tcMar>
+          </w:tcPr>
+          <w:p>
+            <w:r>
+              <w:rPr>
+                <w:rFonts w:ascii="Arial" w:cs="Arial" w:eastAsia="Arial" w:hAnsi="Arial"/>
+                <w:b/>
+                <w:bCs/>
+                <w:color w:val="FFFFFF"/>
+                <w:sz w:val="20"/>
+                <w:szCs w:val="20"/>
+              </w:rPr>
+              <w:t xml:space="preserve">📸 Historial de versiones después de quitar el marcador, con la foto de nuevo como versión actual</w:t>
+            </w:r>
+          </w:p>
+        </w:tc>
+      </w:tr>
+      <w:tr>
+        <w:trPr>
+          <w:trHeight w:val="2400"/>
+        </w:trPr>
+        <w:tc>
+          <w:tcPr>
+            <w:tcW w:type="dxa" w:w="9638"/>
+            <w:tcBorders>
+              <w:top w:val="single" w:color="E0E0E0" w:sz="4"/>
+              <w:left w:val="single" w:color="E0E0E0" w:sz="4"/>
+              <w:bottom w:val="single" w:color="E0E0E0" w:sz="4"/>
+              <w:right w:val="single" w:color="E0E0E0" w:sz="4"/>
+            </w:tcBorders>
+            <w:shd w:fill="FAFAFA" w:val="clear"/>
+            <w:tcMar>
+              <w:top w:type="dxa" w:w="80"/>
+              <w:left w:type="dxa" w:w="160"/>
+              <w:bottom w:type="dxa" w:w="80"/>
+              <w:right w:type="dxa" w:w="160"/>
+            </w:tcMar>
+          </w:tcPr>
+          <w:p>
+            <w:pPr>
+              <w:jc w:val="center"/>
+            </w:pPr>
+            <w:r>
+              <w:rPr>
+                <w:rFonts w:ascii="Arial" w:cs="Arial" w:eastAsia="Arial" w:hAnsi="Arial"/>
+                <w:i/>
+                <w:iCs/>
+                <w:color w:val="757575"/>
+                <w:sz w:val="20"/>
+                <w:szCs w:val="20"/>
+              </w:rPr>
+              <w:t xml:space="preserve">[Pega aquí la captura de pantalla]</w:t>
+            </w:r>
+          </w:p>
+        </w:tc>
+      </w:tr>
+    </w:tbl>
+    <w:p>
+      <w:pPr>
+        <w:spacing w:after="160"/>
+      </w:pPr>
+    </w:p>
+    <w:p>
+      <w:pPr>
+        <w:pBdr>
+          <w:bottom w:val="single" w:color="FFA000" w:sz="4" w:space="1"/>
+        </w:pBdr>
+        <w:spacing w:after="120" w:before="240"/>
+      </w:pPr>
+      <w:r>
+        <w:rPr>
+          <w:rFonts w:ascii="Arial" w:cs="Arial" w:eastAsia="Arial" w:hAnsi="Arial"/>
+          <w:b/>
+          <w:bCs/>
+          <w:color w:val="3949AB"/>
+          <w:sz w:val="24"/>
+          <w:szCs w:val="24"/>
+        </w:rPr>
+        <w:t xml:space="preserve">Accede sin pasar por la CLI</w:t>
+      </w:r>
+    </w:p>
+    <w:p>
+      <w:pPr>
+        <w:spacing w:after="100"/>
+      </w:pPr>
+      <w:r>
+        <w:rPr>
+          <w:rFonts w:ascii="Arial" w:cs="Arial" w:eastAsia="Arial" w:hAnsi="Arial"/>
+          <w:color w:val="212121"/>
+          <w:sz w:val="22"/>
+          <w:szCs w:val="22"/>
+        </w:rPr>
+        <w:t xml:space="preserve">Investiga cómo generar una URL prefirmada para una de tus fotos y ábrela directamente en el navegador, sin usar aws s3 cp. Comprueba que la URL deja de funcionar pasado el tiempo que le has dado.</w:t>
+      </w:r>
+    </w:p>
+    <w:tbl>
+      <w:tblPr>
+        <w:tblW w:type="dxa" w:w="9638"/>
+        <w:tblBorders>
+          <w:top w:val="single" w:color="auto" w:sz="4"/>
+          <w:left w:val="single" w:color="auto" w:sz="4"/>
+          <w:bottom w:val="single" w:color="auto" w:sz="4"/>
+          <w:right w:val="single" w:color="auto" w:sz="4"/>
+          <w:insideH w:val="single" w:color="auto" w:sz="4"/>
+          <w:insideV w:val="single" w:color="auto" w:sz="4"/>
+        </w:tblBorders>
+      </w:tblPr>
+      <w:tblGrid>
+        <w:gridCol w:w="9638"/>
+      </w:tblGrid>
+      <w:tr>
+        <w:tc>
+          <w:tcPr>
+            <w:tcW w:type="dxa" w:w="9638"/>
+            <w:tcBorders>
+              <w:top w:val="none" w:color="FFFFFF" w:sz="0"/>
+              <w:left w:val="none" w:color="FFFFFF" w:sz="0"/>
+              <w:bottom w:val="none" w:color="FFFFFF" w:sz="0"/>
+              <w:right w:val="none" w:color="FFFFFF" w:sz="0"/>
+            </w:tcBorders>
+            <w:shd w:fill="3949AB" w:val="clear"/>
+            <w:tcMar>
+              <w:top w:type="dxa" w:w="80"/>
+              <w:left w:type="dxa" w:w="160"/>
+              <w:bottom w:type="dxa" w:w="80"/>
+              <w:right w:type="dxa" w:w="160"/>
+            </w:tcMar>
+          </w:tcPr>
+          <w:p>
+            <w:r>
+              <w:rPr>
+                <w:rFonts w:ascii="Arial" w:cs="Arial" w:eastAsia="Arial" w:hAnsi="Arial"/>
+                <w:b/>
+                <w:bCs/>
+                <w:color w:val="FFFFFF"/>
+                <w:sz w:val="20"/>
+                <w:szCs w:val="20"/>
+              </w:rPr>
+              <w:t xml:space="preserve">📸 La foto abierta en el navegador desde la URL prefirmada</w:t>
             </w:r>
           </w:p>
         </w:tc>
@@ -1323,8 +1509,287 @@
           <w:sz w:val="22"/>
           <w:szCs w:val="22"/>
         </w:rPr>
-        <w:t xml:space="preserve">Para tres casos de uso (fotos de asistentes ya archivadas, listado de control de acceso consultado constantemente durante el evento, copia de seguridad diaria de la base de datos de reservas), elige familia y clase de almacenamiento calculando coste estimado por GB y por operación. Justifica cada elección.</w:t>
+        <w:t xml:space="preserve">Para tres casos de uso con cantidades concretas (fotos ya archivadas: 80 GB, ~50 lecturas/mes; listado de control de acceso: 2 GB, ~5.000 lecturas/mes; copia de seguridad diaria de la BD: 150 GB, 30 escrituras/mes), elige familia y clase de almacenamiento y calcula con la calculadora oficial de AWS el coste mensual estimado real de cada uno, no solo el precio por GB. Justifica cada elección.</w:t>
       </w:r>
+    </w:p>
+    <w:tbl>
+      <w:tblPr>
+        <w:tblW w:type="dxa" w:w="9638"/>
+        <w:tblBorders>
+          <w:top w:val="single" w:color="auto" w:sz="4"/>
+          <w:left w:val="single" w:color="auto" w:sz="4"/>
+          <w:bottom w:val="single" w:color="auto" w:sz="4"/>
+          <w:right w:val="single" w:color="auto" w:sz="4"/>
+          <w:insideH w:val="single" w:color="auto" w:sz="4"/>
+          <w:insideV w:val="single" w:color="auto" w:sz="4"/>
+        </w:tblBorders>
+      </w:tblPr>
+      <w:tblGrid>
+        <w:gridCol w:w="9638"/>
+      </w:tblGrid>
+      <w:tr>
+        <w:tc>
+          <w:tcPr>
+            <w:tcW w:type="dxa" w:w="9638"/>
+            <w:tcBorders>
+              <w:top w:val="none" w:color="FFFFFF" w:sz="0"/>
+              <w:left w:val="none" w:color="FFFFFF" w:sz="0"/>
+              <w:bottom w:val="none" w:color="FFFFFF" w:sz="0"/>
+              <w:right w:val="none" w:color="FFFFFF" w:sz="0"/>
+            </w:tcBorders>
+            <w:shd w:fill="3949AB" w:val="clear"/>
+            <w:tcMar>
+              <w:top w:type="dxa" w:w="80"/>
+              <w:left w:type="dxa" w:w="160"/>
+              <w:bottom w:type="dxa" w:w="80"/>
+              <w:right w:type="dxa" w:w="160"/>
+            </w:tcMar>
+          </w:tcPr>
+          <w:p>
+            <w:r>
+              <w:rPr>
+                <w:rFonts w:ascii="Arial" w:cs="Arial" w:eastAsia="Arial" w:hAnsi="Arial"/>
+                <w:b/>
+                <w:bCs/>
+                <w:color w:val="FFFFFF"/>
+                <w:sz w:val="20"/>
+                <w:szCs w:val="20"/>
+              </w:rPr>
+              <w:t xml:space="preserve">📸 Calculadora de AWS: resultado para las fotos ya archivadas</w:t>
+            </w:r>
+          </w:p>
+        </w:tc>
+      </w:tr>
+      <w:tr>
+        <w:trPr>
+          <w:trHeight w:val="2400"/>
+        </w:trPr>
+        <w:tc>
+          <w:tcPr>
+            <w:tcW w:type="dxa" w:w="9638"/>
+            <w:tcBorders>
+              <w:top w:val="single" w:color="E0E0E0" w:sz="4"/>
+              <w:left w:val="single" w:color="E0E0E0" w:sz="4"/>
+              <w:bottom w:val="single" w:color="E0E0E0" w:sz="4"/>
+              <w:right w:val="single" w:color="E0E0E0" w:sz="4"/>
+            </w:tcBorders>
+            <w:shd w:fill="FAFAFA" w:val="clear"/>
+            <w:tcMar>
+              <w:top w:type="dxa" w:w="80"/>
+              <w:left w:type="dxa" w:w="160"/>
+              <w:bottom w:type="dxa" w:w="80"/>
+              <w:right w:type="dxa" w:w="160"/>
+            </w:tcMar>
+          </w:tcPr>
+          <w:p>
+            <w:pPr>
+              <w:jc w:val="center"/>
+            </w:pPr>
+            <w:r>
+              <w:rPr>
+                <w:rFonts w:ascii="Arial" w:cs="Arial" w:eastAsia="Arial" w:hAnsi="Arial"/>
+                <w:i/>
+                <w:iCs/>
+                <w:color w:val="757575"/>
+                <w:sz w:val="20"/>
+                <w:szCs w:val="20"/>
+              </w:rPr>
+              <w:t xml:space="preserve">[Pega aquí la captura de pantalla]</w:t>
+            </w:r>
+          </w:p>
+        </w:tc>
+      </w:tr>
+    </w:tbl>
+    <w:p>
+      <w:pPr>
+        <w:spacing w:after="120"/>
+      </w:pPr>
+    </w:p>
+    <w:tbl>
+      <w:tblPr>
+        <w:tblW w:type="dxa" w:w="9638"/>
+        <w:tblBorders>
+          <w:top w:val="single" w:color="auto" w:sz="4"/>
+          <w:left w:val="single" w:color="auto" w:sz="4"/>
+          <w:bottom w:val="single" w:color="auto" w:sz="4"/>
+          <w:right w:val="single" w:color="auto" w:sz="4"/>
+          <w:insideH w:val="single" w:color="auto" w:sz="4"/>
+          <w:insideV w:val="single" w:color="auto" w:sz="4"/>
+        </w:tblBorders>
+      </w:tblPr>
+      <w:tblGrid>
+        <w:gridCol w:w="9638"/>
+      </w:tblGrid>
+      <w:tr>
+        <w:tc>
+          <w:tcPr>
+            <w:tcW w:type="dxa" w:w="9638"/>
+            <w:tcBorders>
+              <w:top w:val="none" w:color="FFFFFF" w:sz="0"/>
+              <w:left w:val="none" w:color="FFFFFF" w:sz="0"/>
+              <w:bottom w:val="none" w:color="FFFFFF" w:sz="0"/>
+              <w:right w:val="none" w:color="FFFFFF" w:sz="0"/>
+            </w:tcBorders>
+            <w:shd w:fill="3949AB" w:val="clear"/>
+            <w:tcMar>
+              <w:top w:type="dxa" w:w="80"/>
+              <w:left w:type="dxa" w:w="160"/>
+              <w:bottom w:type="dxa" w:w="80"/>
+              <w:right w:type="dxa" w:w="160"/>
+            </w:tcMar>
+          </w:tcPr>
+          <w:p>
+            <w:r>
+              <w:rPr>
+                <w:rFonts w:ascii="Arial" w:cs="Arial" w:eastAsia="Arial" w:hAnsi="Arial"/>
+                <w:b/>
+                <w:bCs/>
+                <w:color w:val="FFFFFF"/>
+                <w:sz w:val="20"/>
+                <w:szCs w:val="20"/>
+              </w:rPr>
+              <w:t xml:space="preserve">📸 Calculadora de AWS: resultado para el listado de control de acceso</w:t>
+            </w:r>
+          </w:p>
+        </w:tc>
+      </w:tr>
+      <w:tr>
+        <w:trPr>
+          <w:trHeight w:val="2400"/>
+        </w:trPr>
+        <w:tc>
+          <w:tcPr>
+            <w:tcW w:type="dxa" w:w="9638"/>
+            <w:tcBorders>
+              <w:top w:val="single" w:color="E0E0E0" w:sz="4"/>
+              <w:left w:val="single" w:color="E0E0E0" w:sz="4"/>
+              <w:bottom w:val="single" w:color="E0E0E0" w:sz="4"/>
+              <w:right w:val="single" w:color="E0E0E0" w:sz="4"/>
+            </w:tcBorders>
+            <w:shd w:fill="FAFAFA" w:val="clear"/>
+            <w:tcMar>
+              <w:top w:type="dxa" w:w="80"/>
+              <w:left w:type="dxa" w:w="160"/>
+              <w:bottom w:type="dxa" w:w="80"/>
+              <w:right w:type="dxa" w:w="160"/>
+            </w:tcMar>
+          </w:tcPr>
+          <w:p>
+            <w:pPr>
+              <w:jc w:val="center"/>
+            </w:pPr>
+            <w:r>
+              <w:rPr>
+                <w:rFonts w:ascii="Arial" w:cs="Arial" w:eastAsia="Arial" w:hAnsi="Arial"/>
+                <w:i/>
+                <w:iCs/>
+                <w:color w:val="757575"/>
+                <w:sz w:val="20"/>
+                <w:szCs w:val="20"/>
+              </w:rPr>
+              <w:t xml:space="preserve">[Pega aquí la captura de pantalla]</w:t>
+            </w:r>
+          </w:p>
+        </w:tc>
+      </w:tr>
+    </w:tbl>
+    <w:p>
+      <w:pPr>
+        <w:spacing w:after="120"/>
+      </w:pPr>
+    </w:p>
+    <w:tbl>
+      <w:tblPr>
+        <w:tblW w:type="dxa" w:w="9638"/>
+        <w:tblBorders>
+          <w:top w:val="single" w:color="auto" w:sz="4"/>
+          <w:left w:val="single" w:color="auto" w:sz="4"/>
+          <w:bottom w:val="single" w:color="auto" w:sz="4"/>
+          <w:right w:val="single" w:color="auto" w:sz="4"/>
+          <w:insideH w:val="single" w:color="auto" w:sz="4"/>
+          <w:insideV w:val="single" w:color="auto" w:sz="4"/>
+        </w:tblBorders>
+      </w:tblPr>
+      <w:tblGrid>
+        <w:gridCol w:w="9638"/>
+      </w:tblGrid>
+      <w:tr>
+        <w:tc>
+          <w:tcPr>
+            <w:tcW w:type="dxa" w:w="9638"/>
+            <w:tcBorders>
+              <w:top w:val="none" w:color="FFFFFF" w:sz="0"/>
+              <w:left w:val="none" w:color="FFFFFF" w:sz="0"/>
+              <w:bottom w:val="none" w:color="FFFFFF" w:sz="0"/>
+              <w:right w:val="none" w:color="FFFFFF" w:sz="0"/>
+            </w:tcBorders>
+            <w:shd w:fill="3949AB" w:val="clear"/>
+            <w:tcMar>
+              <w:top w:type="dxa" w:w="80"/>
+              <w:left w:type="dxa" w:w="160"/>
+              <w:bottom w:type="dxa" w:w="80"/>
+              <w:right w:type="dxa" w:w="160"/>
+            </w:tcMar>
+          </w:tcPr>
+          <w:p>
+            <w:r>
+              <w:rPr>
+                <w:rFonts w:ascii="Arial" w:cs="Arial" w:eastAsia="Arial" w:hAnsi="Arial"/>
+                <w:b/>
+                <w:bCs/>
+                <w:color w:val="FFFFFF"/>
+                <w:sz w:val="20"/>
+                <w:szCs w:val="20"/>
+              </w:rPr>
+              <w:t xml:space="preserve">📸 Calculadora de AWS: resultado para la copia de seguridad de la BD</w:t>
+            </w:r>
+          </w:p>
+        </w:tc>
+      </w:tr>
+      <w:tr>
+        <w:trPr>
+          <w:trHeight w:val="2400"/>
+        </w:trPr>
+        <w:tc>
+          <w:tcPr>
+            <w:tcW w:type="dxa" w:w="9638"/>
+            <w:tcBorders>
+              <w:top w:val="single" w:color="E0E0E0" w:sz="4"/>
+              <w:left w:val="single" w:color="E0E0E0" w:sz="4"/>
+              <w:bottom w:val="single" w:color="E0E0E0" w:sz="4"/>
+              <w:right w:val="single" w:color="E0E0E0" w:sz="4"/>
+            </w:tcBorders>
+            <w:shd w:fill="FAFAFA" w:val="clear"/>
+            <w:tcMar>
+              <w:top w:type="dxa" w:w="80"/>
+              <w:left w:type="dxa" w:w="160"/>
+              <w:bottom w:type="dxa" w:w="80"/>
+              <w:right w:type="dxa" w:w="160"/>
+            </w:tcMar>
+          </w:tcPr>
+          <w:p>
+            <w:pPr>
+              <w:jc w:val="center"/>
+            </w:pPr>
+            <w:r>
+              <w:rPr>
+                <w:rFonts w:ascii="Arial" w:cs="Arial" w:eastAsia="Arial" w:hAnsi="Arial"/>
+                <w:i/>
+                <w:iCs/>
+                <w:color w:val="757575"/>
+                <w:sz w:val="20"/>
+                <w:szCs w:val="20"/>
+              </w:rPr>
+              <w:t xml:space="preserve">[Pega aquí la captura de pantalla]</w:t>
+            </w:r>
+          </w:p>
+        </w:tc>
+      </w:tr>
+    </w:tbl>
+    <w:p>
+      <w:pPr>
+        <w:spacing w:after="120"/>
+      </w:pPr>
     </w:p>
     <w:tbl>
       <w:tblPr>
@@ -1443,7 +1908,7 @@
                 <w:sz w:val="20"/>
                 <w:szCs w:val="20"/>
               </w:rPr>
-              <w:t xml:space="preserve">Coste estimado</w:t>
+              <w:t xml:space="preserve">Coste mensual estimado</w:t>
             </w:r>
           </w:p>
         </w:tc>

</xml_diff>